<commit_message>
cambiar header a azul
</commit_message>
<xml_diff>
--- a/app/templates/template_1.docx
+++ b/app/templates/template_1.docx
@@ -128,6 +128,7 @@
               <w:bottom w:val="nil"/>
               <w:right w:val="nil"/>
             </w:tcBorders>
+            <w:shd w:fill="3465A4" w:val="clear"/>
             <w:vAlign w:val="center"/>
           </w:tcPr>
           <w:p>
@@ -137,14 +138,13 @@
               <w:spacing w:before="0" w:after="0"/>
               <w:jc w:val="left"/>
               <w:rPr>
-                <w:rFonts w:cs="Arial"/>
-                <w:b/>
-                <w:b/>
-              </w:rPr>
-            </w:pPr>
-            <w:r>
-              <w:rPr>
-                <w:b/>
+                <w:color w:val="EEEEEE"/>
+              </w:rPr>
+            </w:pPr>
+            <w:r>
+              <w:rPr>
+                <w:b/>
+                <w:color w:val="EEEEEE"/>
               </w:rPr>
               <w:t>I.</w:t>
               <w:tab/>
@@ -929,6 +929,7 @@
               <w:bottom w:val="single" w:sz="4" w:space="0" w:color="1F497D"/>
               <w:right w:val="single" w:sz="4" w:space="0" w:color="1F497D"/>
             </w:tcBorders>
+            <w:shd w:fill="3465A4" w:val="clear"/>
             <w:vAlign w:val="center"/>
           </w:tcPr>
           <w:p>
@@ -940,15 +941,14 @@
               <w:ind w:hanging="0"/>
               <w:jc w:val="left"/>
               <w:rPr>
-                <w:rFonts w:ascii="Calibri" w:hAnsi="Calibri" w:cs="Calibri" w:asciiTheme="minorHAnsi" w:cstheme="minorHAnsi" w:hAnsiTheme="minorHAnsi"/>
-                <w:b/>
-                <w:b/>
+                <w:color w:val="EEEEEE"/>
               </w:rPr>
             </w:pPr>
             <w:r>
               <w:rPr>
                 <w:rFonts w:cs="Calibri" w:ascii="Calibri" w:hAnsi="Calibri" w:cstheme="minorHAnsi"/>
                 <w:b/>
+                <w:color w:val="EEEEEE"/>
               </w:rPr>
               <w:t>II.</w:t>
               <w:tab/>
@@ -9070,7 +9070,7 @@
               <w:docPartGallery w:val="Page Numbers (Top of Page)"/>
               <w:docPartUnique w:val="true"/>
             </w:docPartObj>
-            <w:id w:val="373365601"/>
+            <w:id w:val="280531477"/>
           </w:sdtPr>
           <w:sdtContent>
             <w:p>
@@ -9254,7 +9254,7 @@
               <w:docPartGallery w:val="Page Numbers (Top of Page)"/>
               <w:docPartUnique w:val="true"/>
             </w:docPartObj>
-            <w:id w:val="1036559442"/>
+            <w:id w:val="1921050197"/>
           </w:sdtPr>
           <w:sdtContent>
             <w:p>

</xml_diff>